<commit_message>
JD template: remove the offer-letter NOTE block from the JD header
The jd-template.docx carried "NOTE: This is a temporary/ Conditional
offer and cannot be used for Negotiations with other companies." — that
is offer-letter boilerplate and doesn't belong on a Job Description.
Removed both paragraphs (the NOTE: header + the sentence) from
word/document.xml; {{JobTitle}} + {{Body}} placeholders intact, docx
re-extracts cleanly.
</commit_message>
<xml_diff>
--- a/public/templates/jd-template.docx
+++ b/public/templates/jd-template.docx
@@ -228,76 +228,6 @@
       </w:pPr>
       <w:bookmarkStart w:id="0" w:name="_heading=h.eztoy7e4axs" w:colFirst="0" w:colLast="0"/>
       <w:bookmarkEnd w:id="0"/>
-    </w:p>
-    <w:p>
-      <w:pPr>
-        <w:pStyle w:val="Heading1"/>
-        <w:keepNext w:val="0"/>
-        <w:keepLines w:val="0"/>
-        <w:widowControl w:val="0"/>
-        <w:pBdr>
-          <w:top w:val="nil"/>
-          <w:left w:val="nil"/>
-          <w:bottom w:val="nil"/>
-          <w:right w:val="nil"/>
-          <w:between w:val="nil"/>
-        </w:pBdr>
-        <w:spacing w:before="80" w:after="0" w:line="240" w:lineRule="auto"/>
-        <w:ind w:left="500"/>
-        <w:jc w:val="center"/>
-        <w:rPr>
-          <w:rFonts w:ascii="Times New Roman" w:eastAsia="Times New Roman" w:hAnsi="Times New Roman" w:cs="Times New Roman"/>
-          <w:color w:val="666666"/>
-          <w:sz w:val="16"/>
-          <w:szCs w:val="16"/>
-        </w:rPr>
-      </w:pPr>
-      <w:bookmarkStart w:id="1" w:name="_heading=h.pxdbetg9sbwj" w:colFirst="0" w:colLast="0"/>
-      <w:bookmarkEnd w:id="1"/>
-      <w:r>
-        <w:rPr>
-          <w:rFonts w:ascii="Times New Roman" w:eastAsia="Times New Roman" w:hAnsi="Times New Roman" w:cs="Times New Roman"/>
-          <w:color w:val="666666"/>
-          <w:sz w:val="16"/>
-          <w:szCs w:val="16"/>
-        </w:rPr>
-        <w:t>NOTE:</w:t>
-      </w:r>
-    </w:p>
-    <w:p>
-      <w:pPr>
-        <w:pStyle w:val="Heading1"/>
-        <w:keepNext w:val="0"/>
-        <w:keepLines w:val="0"/>
-        <w:widowControl w:val="0"/>
-        <w:pBdr>
-          <w:top w:val="nil"/>
-          <w:left w:val="nil"/>
-          <w:bottom w:val="nil"/>
-          <w:right w:val="nil"/>
-          <w:between w:val="nil"/>
-        </w:pBdr>
-        <w:spacing w:before="80" w:after="0" w:line="240" w:lineRule="auto"/>
-        <w:ind w:left="500"/>
-        <w:jc w:val="center"/>
-        <w:rPr>
-          <w:rFonts w:ascii="Times New Roman" w:eastAsia="Times New Roman" w:hAnsi="Times New Roman" w:cs="Times New Roman"/>
-          <w:color w:val="1C1C1C"/>
-          <w:sz w:val="26"/>
-          <w:szCs w:val="26"/>
-        </w:rPr>
-      </w:pPr>
-      <w:bookmarkStart w:id="2" w:name="_heading=h.mybbagmuxkqk" w:colFirst="0" w:colLast="0"/>
-      <w:bookmarkEnd w:id="2"/>
-      <w:r>
-        <w:rPr>
-          <w:rFonts w:ascii="Times New Roman" w:eastAsia="Times New Roman" w:hAnsi="Times New Roman" w:cs="Times New Roman"/>
-          <w:color w:val="666666"/>
-          <w:sz w:val="16"/>
-          <w:szCs w:val="16"/>
-        </w:rPr>
-        <w:t>This is a temporary/ Conditional offer and cannot be used for Negotiations with other companies.</w:t>
-      </w:r>
     </w:p>
     <w:p>
       <w:pPr>

</xml_diff>